<commit_message>
Mention Jeff by full name
</commit_message>
<xml_diff>
--- a/sources/StopTalking.docx
+++ b/sources/StopTalking.docx
@@ -173,7 +173,15 @@
       </w:pPr>
       <w:r>
         <w:rPr/>
-        <w:t>Two years ago, he appointed himself to a Charter Review Committee and attempted to strip authority from the Board of Finance and Board of Education, concentrating it in his own hands. When that failed, he exploited a little-known Charter provision to insert himself into those Boards' meetings.</w:t>
+        <w:t xml:space="preserve">Two years ago, </w:t>
+      </w:r>
+      <w:r>
+        <w:rPr/>
+        <w:t>Jeff Maguire</w:t>
+      </w:r>
+      <w:r>
+        <w:rPr/>
+        <w:t xml:space="preserve"> appointed himself to a Charter Review Committee and attempted to strip authority from the Board of Finance and Board of Education, concentrating it in his own hands. When that failed, he exploited a little-known Charter provision to insert himself into those Boards' meetings.</w:t>
       </w:r>
     </w:p>
     <w:p>
@@ -453,15 +461,15 @@
       <w:u w:val="single"/>
     </w:rPr>
   </w:style>
+  <w:style w:type="character" w:styleId="Bullets">
+    <w:name w:val="Bullets"/>
+    <w:qFormat/>
+    <w:rPr>
+      <w:rFonts w:ascii="OpenSymbol" w:hAnsi="OpenSymbol" w:eastAsia="OpenSymbol" w:cs="OpenSymbol"/>
+    </w:rPr>
+  </w:style>
   <w:style w:type="character" w:styleId="Bulletsuser">
     <w:name w:val="Bullets (user)"/>
-    <w:qFormat/>
-    <w:rPr>
-      <w:rFonts w:ascii="OpenSymbol" w:hAnsi="OpenSymbol" w:eastAsia="OpenSymbol" w:cs="OpenSymbol"/>
-    </w:rPr>
-  </w:style>
-  <w:style w:type="character" w:styleId="Bullets">
-    <w:name w:val="Bullets"/>
     <w:qFormat/>
     <w:rPr>
       <w:rFonts w:ascii="OpenSymbol" w:hAnsi="OpenSymbol" w:eastAsia="OpenSymbol" w:cs="OpenSymbol"/>

</xml_diff>